<commit_message>
Fix confirmation form Word layout
</commit_message>
<xml_diff>
--- a/templates/資遣確認單-範本.docx
+++ b/templates/資遣確認單-範本.docx
@@ -49,6 +49,9 @@
         <w:gridCol w:w="9411"/>
       </w:tblGrid>
       <w:tr>
+        <w:trPr>
+          <w:cantSplit/>
+        </w:trPr>
         <w:tc>
           <w:tcPr>
             <w:tcW w:type="dxa" w:w="5046"/>
@@ -63,6 +66,7 @@
           </w:tcPr>
           <w:p>
             <w:pPr>
+              <w:keepLines/>
               <w:spacing w:before="0" w:after="0" w:line="252" w:lineRule="auto"/>
               <w:jc w:val="center"/>
             </w:pPr>
@@ -92,6 +96,8 @@
           </w:tcPr>
           <w:p>
             <w:pPr>
+              <w:keepNext/>
+              <w:keepLines/>
               <w:spacing w:before="0" w:after="0" w:line="252" w:lineRule="auto"/>
               <w:jc w:val="left"/>
             </w:pPr>
@@ -135,6 +141,9 @@
         <w:gridCol w:w="3572"/>
       </w:tblGrid>
       <w:tr>
+        <w:trPr>
+          <w:cantSplit/>
+        </w:trPr>
         <w:tc>
           <w:tcPr>
             <w:tcW w:type="dxa" w:w="2523"/>
@@ -149,6 +158,7 @@
           </w:tcPr>
           <w:p>
             <w:pPr>
+              <w:keepLines/>
               <w:spacing w:before="0" w:after="0" w:line="252" w:lineRule="auto"/>
               <w:jc w:val="left"/>
             </w:pPr>
@@ -178,6 +188,7 @@
           </w:tcPr>
           <w:p>
             <w:pPr>
+              <w:keepLines/>
               <w:spacing w:before="0" w:after="0" w:line="252" w:lineRule="auto"/>
               <w:jc w:val="left"/>
             </w:pPr>
@@ -207,6 +218,7 @@
           </w:tcPr>
           <w:p>
             <w:pPr>
+              <w:keepLines/>
               <w:spacing w:before="0" w:after="0" w:line="252" w:lineRule="auto"/>
               <w:jc w:val="left"/>
             </w:pPr>
@@ -236,6 +248,7 @@
           </w:tcPr>
           <w:p>
             <w:pPr>
+              <w:keepLines/>
               <w:spacing w:before="0" w:after="0" w:line="252" w:lineRule="auto"/>
               <w:jc w:val="left"/>
             </w:pPr>
@@ -253,6 +266,9 @@
         </w:tc>
       </w:tr>
       <w:tr>
+        <w:trPr>
+          <w:cantSplit/>
+        </w:trPr>
         <w:tc>
           <w:tcPr>
             <w:tcW w:type="dxa" w:w="2523"/>
@@ -267,6 +283,7 @@
           </w:tcPr>
           <w:p>
             <w:pPr>
+              <w:keepLines/>
               <w:spacing w:before="0" w:after="0" w:line="252" w:lineRule="auto"/>
               <w:jc w:val="left"/>
             </w:pPr>
@@ -296,6 +313,7 @@
           </w:tcPr>
           <w:p>
             <w:pPr>
+              <w:keepLines/>
               <w:spacing w:before="0" w:after="0" w:line="252" w:lineRule="auto"/>
               <w:jc w:val="left"/>
             </w:pPr>
@@ -325,6 +343,7 @@
           </w:tcPr>
           <w:p>
             <w:pPr>
+              <w:keepLines/>
               <w:spacing w:before="0" w:after="0" w:line="252" w:lineRule="auto"/>
               <w:jc w:val="left"/>
             </w:pPr>
@@ -354,6 +373,7 @@
           </w:tcPr>
           <w:p>
             <w:pPr>
+              <w:keepLines/>
               <w:spacing w:before="0" w:after="0" w:line="252" w:lineRule="auto"/>
               <w:jc w:val="left"/>
             </w:pPr>
@@ -371,6 +391,9 @@
         </w:tc>
       </w:tr>
       <w:tr>
+        <w:trPr>
+          <w:cantSplit/>
+        </w:trPr>
         <w:tc>
           <w:tcPr>
             <w:tcW w:type="dxa" w:w="2523"/>
@@ -385,6 +408,7 @@
           </w:tcPr>
           <w:p>
             <w:pPr>
+              <w:keepLines/>
               <w:spacing w:before="0" w:after="0" w:line="252" w:lineRule="auto"/>
               <w:jc w:val="left"/>
             </w:pPr>
@@ -414,6 +438,7 @@
           </w:tcPr>
           <w:p>
             <w:pPr>
+              <w:keepLines/>
               <w:spacing w:before="0" w:after="0" w:line="252" w:lineRule="auto"/>
               <w:jc w:val="left"/>
             </w:pPr>
@@ -443,6 +468,7 @@
           </w:tcPr>
           <w:p>
             <w:pPr>
+              <w:keepLines/>
               <w:spacing w:before="0" w:after="0" w:line="252" w:lineRule="auto"/>
               <w:jc w:val="left"/>
             </w:pPr>
@@ -472,6 +498,7 @@
           </w:tcPr>
           <w:p>
             <w:pPr>
+              <w:keepLines/>
               <w:spacing w:before="0" w:after="0" w:line="252" w:lineRule="auto"/>
               <w:jc w:val="left"/>
             </w:pPr>
@@ -513,6 +540,9 @@
         <w:gridCol w:w="9411"/>
       </w:tblGrid>
       <w:tr>
+        <w:trPr>
+          <w:cantSplit/>
+        </w:trPr>
         <w:tc>
           <w:tcPr>
             <w:tcW w:type="dxa" w:w="5046"/>
@@ -527,6 +557,7 @@
           </w:tcPr>
           <w:p>
             <w:pPr>
+              <w:keepLines/>
               <w:spacing w:before="0" w:after="0" w:line="252" w:lineRule="auto"/>
               <w:jc w:val="center"/>
             </w:pPr>
@@ -556,6 +587,8 @@
           </w:tcPr>
           <w:p>
             <w:pPr>
+              <w:keepNext/>
+              <w:keepLines/>
               <w:spacing w:before="0" w:after="0" w:line="252" w:lineRule="auto"/>
               <w:jc w:val="left"/>
             </w:pPr>
@@ -597,6 +630,10 @@
         <w:gridCol w:w="8164"/>
       </w:tblGrid>
       <w:tr>
+        <w:trPr>
+          <w:cantSplit/>
+          <w:trHeight w:val="1361" w:hRule="atLeast"/>
+        </w:trPr>
         <w:tc>
           <w:tcPr>
             <w:tcW w:type="dxa" w:w="5046"/>
@@ -611,6 +648,7 @@
           </w:tcPr>
           <w:p>
             <w:pPr>
+              <w:keepLines/>
               <w:spacing w:before="0" w:after="0" w:line="252" w:lineRule="auto"/>
               <w:jc w:val="left"/>
             </w:pPr>
@@ -639,6 +677,7 @@
           </w:tcPr>
           <w:p>
             <w:pPr>
+              <w:keepLines/>
               <w:spacing w:before="0" w:after="0" w:line="252" w:lineRule="auto"/>
               <w:jc w:val="left"/>
             </w:pPr>
@@ -656,6 +695,10 @@
         </w:tc>
       </w:tr>
       <w:tr>
+        <w:trPr>
+          <w:cantSplit/>
+          <w:trHeight w:val="1928" w:hRule="atLeast"/>
+        </w:trPr>
         <w:tc>
           <w:tcPr>
             <w:tcW w:type="dxa" w:w="5046"/>
@@ -670,6 +713,7 @@
           </w:tcPr>
           <w:p>
             <w:pPr>
+              <w:keepLines/>
               <w:spacing w:before="0" w:after="0" w:line="252" w:lineRule="auto"/>
               <w:jc w:val="left"/>
             </w:pPr>
@@ -698,6 +742,7 @@
           </w:tcPr>
           <w:p>
             <w:pPr>
+              <w:keepLines/>
               <w:spacing w:before="0" w:after="0" w:line="252" w:lineRule="auto"/>
               <w:jc w:val="left"/>
             </w:pPr>
@@ -715,6 +760,10 @@
         </w:tc>
       </w:tr>
       <w:tr>
+        <w:trPr>
+          <w:cantSplit/>
+          <w:trHeight w:val="1020" w:hRule="atLeast"/>
+        </w:trPr>
         <w:tc>
           <w:tcPr>
             <w:tcW w:type="dxa" w:w="5046"/>
@@ -729,6 +778,7 @@
           </w:tcPr>
           <w:p>
             <w:pPr>
+              <w:keepLines/>
               <w:spacing w:before="0" w:after="0" w:line="252" w:lineRule="auto"/>
               <w:jc w:val="left"/>
             </w:pPr>
@@ -757,6 +807,7 @@
           </w:tcPr>
           <w:p>
             <w:pPr>
+              <w:keepLines/>
               <w:spacing w:before="0" w:after="0" w:line="252" w:lineRule="auto"/>
               <w:jc w:val="left"/>
             </w:pPr>
@@ -798,6 +849,9 @@
         <w:gridCol w:w="9411"/>
       </w:tblGrid>
       <w:tr>
+        <w:trPr>
+          <w:cantSplit/>
+        </w:trPr>
         <w:tc>
           <w:tcPr>
             <w:tcW w:type="dxa" w:w="5046"/>
@@ -812,6 +866,7 @@
           </w:tcPr>
           <w:p>
             <w:pPr>
+              <w:keepLines/>
               <w:spacing w:before="0" w:after="0" w:line="252" w:lineRule="auto"/>
               <w:jc w:val="center"/>
             </w:pPr>
@@ -841,6 +896,8 @@
           </w:tcPr>
           <w:p>
             <w:pPr>
+              <w:keepNext/>
+              <w:keepLines/>
               <w:spacing w:before="0" w:after="0" w:line="252" w:lineRule="auto"/>
               <w:jc w:val="left"/>
             </w:pPr>
@@ -882,6 +939,9 @@
         <w:gridCol w:w="5046"/>
       </w:tblGrid>
       <w:tr>
+        <w:trPr>
+          <w:cantSplit/>
+        </w:trPr>
         <w:tc>
           <w:tcPr>
             <w:tcW w:type="dxa" w:w="5046"/>
@@ -896,6 +956,7 @@
           </w:tcPr>
           <w:p>
             <w:pPr>
+              <w:keepLines/>
               <w:spacing w:before="0" w:after="0" w:line="252" w:lineRule="auto"/>
               <w:jc w:val="center"/>
             </w:pPr>
@@ -925,6 +986,7 @@
           </w:tcPr>
           <w:p>
             <w:pPr>
+              <w:keepLines/>
               <w:spacing w:before="0" w:after="0" w:line="252" w:lineRule="auto"/>
               <w:jc w:val="center"/>
             </w:pPr>
@@ -942,6 +1004,9 @@
         </w:tc>
       </w:tr>
       <w:tr>
+        <w:trPr>
+          <w:cantSplit/>
+        </w:trPr>
         <w:tc>
           <w:tcPr>
             <w:tcW w:type="dxa" w:w="5046"/>
@@ -955,6 +1020,7 @@
           </w:tcPr>
           <w:p>
             <w:pPr>
+              <w:keepLines/>
               <w:spacing w:before="0" w:after="0" w:line="252" w:lineRule="auto"/>
               <w:jc w:val="center"/>
             </w:pPr>
@@ -986,6 +1052,7 @@
           </w:tcPr>
           <w:p>
             <w:pPr>
+              <w:keepLines/>
               <w:spacing w:before="0" w:after="0" w:line="252" w:lineRule="auto"/>
               <w:jc w:val="center"/>
             </w:pPr>
@@ -1030,6 +1097,9 @@
         <w:gridCol w:w="9411"/>
       </w:tblGrid>
       <w:tr>
+        <w:trPr>
+          <w:cantSplit/>
+        </w:trPr>
         <w:tc>
           <w:tcPr>
             <w:tcW w:type="dxa" w:w="5046"/>
@@ -1044,6 +1114,7 @@
           </w:tcPr>
           <w:p>
             <w:pPr>
+              <w:keepLines/>
               <w:spacing w:before="0" w:after="0" w:line="252" w:lineRule="auto"/>
               <w:jc w:val="center"/>
             </w:pPr>
@@ -1073,6 +1144,8 @@
           </w:tcPr>
           <w:p>
             <w:pPr>
+              <w:keepNext/>
+              <w:keepLines/>
               <w:spacing w:before="0" w:after="0" w:line="252" w:lineRule="auto"/>
               <w:jc w:val="left"/>
             </w:pPr>
@@ -1114,6 +1187,9 @@
         <w:gridCol w:w="5046"/>
       </w:tblGrid>
       <w:tr>
+        <w:trPr>
+          <w:cantSplit/>
+        </w:trPr>
         <w:tc>
           <w:tcPr>
             <w:tcW w:type="dxa" w:w="5046"/>
@@ -1128,6 +1204,7 @@
           </w:tcPr>
           <w:p>
             <w:pPr>
+              <w:keepLines/>
               <w:spacing w:before="0" w:after="0" w:line="252" w:lineRule="auto"/>
               <w:jc w:val="left"/>
             </w:pPr>
@@ -1157,6 +1234,7 @@
           </w:tcPr>
           <w:p>
             <w:pPr>
+              <w:keepLines/>
               <w:spacing w:before="0" w:after="0" w:line="252" w:lineRule="auto"/>
               <w:jc w:val="left"/>
             </w:pPr>
@@ -1174,6 +1252,9 @@
         </w:tc>
       </w:tr>
       <w:tr>
+        <w:trPr>
+          <w:cantSplit/>
+        </w:trPr>
         <w:tc>
           <w:tcPr>
             <w:tcW w:type="dxa" w:w="5046"/>
@@ -1188,6 +1269,7 @@
           </w:tcPr>
           <w:p>
             <w:pPr>
+              <w:keepLines/>
               <w:spacing w:before="0" w:after="0" w:line="252" w:lineRule="auto"/>
               <w:jc w:val="left"/>
             </w:pPr>
@@ -1217,6 +1299,7 @@
           </w:tcPr>
           <w:p>
             <w:pPr>
+              <w:keepLines/>
               <w:spacing w:before="0" w:after="0" w:line="252" w:lineRule="auto"/>
               <w:jc w:val="left"/>
             </w:pPr>
@@ -1234,6 +1317,9 @@
         </w:tc>
       </w:tr>
       <w:tr>
+        <w:trPr>
+          <w:cantSplit/>
+        </w:trPr>
         <w:tc>
           <w:tcPr>
             <w:tcW w:type="dxa" w:w="5046"/>
@@ -1248,6 +1334,7 @@
           </w:tcPr>
           <w:p>
             <w:pPr>
+              <w:keepLines/>
               <w:spacing w:before="0" w:after="0" w:line="252" w:lineRule="auto"/>
               <w:jc w:val="left"/>
             </w:pPr>
@@ -1277,6 +1364,7 @@
           </w:tcPr>
           <w:p>
             <w:pPr>
+              <w:keepLines/>
               <w:spacing w:before="0" w:after="0" w:line="252" w:lineRule="auto"/>
               <w:jc w:val="left"/>
             </w:pPr>

</xml_diff>

<commit_message>
Refine confirmation form exports
</commit_message>
<xml_diff>
--- a/templates/資遣確認單-範本.docx
+++ b/templates/資遣確認單-範本.docx
@@ -32,7 +32,7 @@
     </w:p>
     <w:tbl>
       <w:tblPr>
-        <w:tblW w:type="auto" w:w="0"/>
+        <w:tblW w:type="dxa" w:w="10091"/>
         <w:tblLayout w:type="fixed"/>
         <w:tblLook w:firstColumn="1" w:firstRow="1" w:lastColumn="0" w:lastRow="0" w:noHBand="0" w:noVBand="1" w:val="04A0"/>
         <w:tblBorders>
@@ -45,8 +45,8 @@
         </w:tblBorders>
       </w:tblPr>
       <w:tblGrid>
-        <w:gridCol w:w="680"/>
-        <w:gridCol w:w="9411"/>
+        <w:gridCol w:w="510"/>
+        <w:gridCol w:w="9581"/>
       </w:tblGrid>
       <w:tr>
         <w:trPr>
@@ -54,7 +54,7 @@
         </w:trPr>
         <w:tc>
           <w:tcPr>
-            <w:tcW w:type="dxa" w:w="5046"/>
+            <w:tcW w:type="dxa" w:w="510"/>
             <w:vAlign w:val="center"/>
             <w:tcMar>
               <w:top w:w="90" w:type="dxa"/>
@@ -84,7 +84,7 @@
         </w:tc>
         <w:tc>
           <w:tcPr>
-            <w:tcW w:type="dxa" w:w="5046"/>
+            <w:tcW w:type="dxa" w:w="9581"/>
             <w:vAlign w:val="center"/>
             <w:tcMar>
               <w:top w:w="90" w:type="dxa"/>
@@ -122,7 +122,7 @@
     </w:p>
     <w:tbl>
       <w:tblPr>
-        <w:tblW w:type="auto" w:w="0"/>
+        <w:tblW w:type="dxa" w:w="10092"/>
         <w:tblLayout w:type="fixed"/>
         <w:tblLook w:firstColumn="1" w:firstRow="1" w:lastColumn="0" w:lastRow="0" w:noHBand="0" w:noVBand="1" w:val="04A0"/>
         <w:tblBorders>
@@ -146,7 +146,7 @@
         </w:trPr>
         <w:tc>
           <w:tcPr>
-            <w:tcW w:type="dxa" w:w="2523"/>
+            <w:tcW w:type="dxa" w:w="1474"/>
             <w:vAlign w:val="center"/>
             <w:tcMar>
               <w:top w:w="90" w:type="dxa"/>
@@ -176,7 +176,7 @@
         </w:tc>
         <w:tc>
           <w:tcPr>
-            <w:tcW w:type="dxa" w:w="2523"/>
+            <w:tcW w:type="dxa" w:w="3572"/>
             <w:vAlign w:val="center"/>
             <w:tcMar>
               <w:top w:w="90" w:type="dxa"/>
@@ -206,7 +206,7 @@
         </w:tc>
         <w:tc>
           <w:tcPr>
-            <w:tcW w:type="dxa" w:w="2523"/>
+            <w:tcW w:type="dxa" w:w="1474"/>
             <w:vAlign w:val="center"/>
             <w:tcMar>
               <w:top w:w="90" w:type="dxa"/>
@@ -236,7 +236,7 @@
         </w:tc>
         <w:tc>
           <w:tcPr>
-            <w:tcW w:type="dxa" w:w="2523"/>
+            <w:tcW w:type="dxa" w:w="3572"/>
             <w:vAlign w:val="center"/>
             <w:tcMar>
               <w:top w:w="90" w:type="dxa"/>
@@ -271,7 +271,7 @@
         </w:trPr>
         <w:tc>
           <w:tcPr>
-            <w:tcW w:type="dxa" w:w="2523"/>
+            <w:tcW w:type="dxa" w:w="1474"/>
             <w:vAlign w:val="center"/>
             <w:tcMar>
               <w:top w:w="90" w:type="dxa"/>
@@ -301,7 +301,7 @@
         </w:tc>
         <w:tc>
           <w:tcPr>
-            <w:tcW w:type="dxa" w:w="2523"/>
+            <w:tcW w:type="dxa" w:w="3572"/>
             <w:vAlign w:val="center"/>
             <w:tcMar>
               <w:top w:w="90" w:type="dxa"/>
@@ -331,7 +331,7 @@
         </w:tc>
         <w:tc>
           <w:tcPr>
-            <w:tcW w:type="dxa" w:w="2523"/>
+            <w:tcW w:type="dxa" w:w="1474"/>
             <w:vAlign w:val="center"/>
             <w:tcMar>
               <w:top w:w="90" w:type="dxa"/>
@@ -361,7 +361,7 @@
         </w:tc>
         <w:tc>
           <w:tcPr>
-            <w:tcW w:type="dxa" w:w="2523"/>
+            <w:tcW w:type="dxa" w:w="3572"/>
             <w:vAlign w:val="center"/>
             <w:tcMar>
               <w:top w:w="90" w:type="dxa"/>
@@ -396,7 +396,7 @@
         </w:trPr>
         <w:tc>
           <w:tcPr>
-            <w:tcW w:type="dxa" w:w="2523"/>
+            <w:tcW w:type="dxa" w:w="1474"/>
             <w:vAlign w:val="center"/>
             <w:tcMar>
               <w:top w:w="90" w:type="dxa"/>
@@ -426,7 +426,7 @@
         </w:tc>
         <w:tc>
           <w:tcPr>
-            <w:tcW w:type="dxa" w:w="2523"/>
+            <w:tcW w:type="dxa" w:w="3572"/>
             <w:vAlign w:val="center"/>
             <w:tcMar>
               <w:top w:w="90" w:type="dxa"/>
@@ -456,7 +456,7 @@
         </w:tc>
         <w:tc>
           <w:tcPr>
-            <w:tcW w:type="dxa" w:w="2523"/>
+            <w:tcW w:type="dxa" w:w="1474"/>
             <w:vAlign w:val="center"/>
             <w:tcMar>
               <w:top w:w="90" w:type="dxa"/>
@@ -486,7 +486,7 @@
         </w:tc>
         <w:tc>
           <w:tcPr>
-            <w:tcW w:type="dxa" w:w="2523"/>
+            <w:tcW w:type="dxa" w:w="3572"/>
             <w:vAlign w:val="center"/>
             <w:tcMar>
               <w:top w:w="90" w:type="dxa"/>
@@ -523,7 +523,7 @@
     </w:p>
     <w:tbl>
       <w:tblPr>
-        <w:tblW w:type="auto" w:w="0"/>
+        <w:tblW w:type="dxa" w:w="10091"/>
         <w:tblLayout w:type="fixed"/>
         <w:tblLook w:firstColumn="1" w:firstRow="1" w:lastColumn="0" w:lastRow="0" w:noHBand="0" w:noVBand="1" w:val="04A0"/>
         <w:tblBorders>
@@ -536,8 +536,8 @@
         </w:tblBorders>
       </w:tblPr>
       <w:tblGrid>
-        <w:gridCol w:w="680"/>
-        <w:gridCol w:w="9411"/>
+        <w:gridCol w:w="510"/>
+        <w:gridCol w:w="9581"/>
       </w:tblGrid>
       <w:tr>
         <w:trPr>
@@ -545,7 +545,7 @@
         </w:trPr>
         <w:tc>
           <w:tcPr>
-            <w:tcW w:type="dxa" w:w="5046"/>
+            <w:tcW w:type="dxa" w:w="510"/>
             <w:vAlign w:val="center"/>
             <w:tcMar>
               <w:top w:w="90" w:type="dxa"/>
@@ -575,7 +575,7 @@
         </w:tc>
         <w:tc>
           <w:tcPr>
-            <w:tcW w:type="dxa" w:w="5046"/>
+            <w:tcW w:type="dxa" w:w="9581"/>
             <w:vAlign w:val="center"/>
             <w:tcMar>
               <w:top w:w="90" w:type="dxa"/>
@@ -613,7 +613,7 @@
     </w:p>
     <w:tbl>
       <w:tblPr>
-        <w:tblW w:type="auto" w:w="0"/>
+        <w:tblW w:type="dxa" w:w="10092"/>
         <w:tblLayout w:type="fixed"/>
         <w:tblLook w:firstColumn="1" w:firstRow="1" w:lastColumn="0" w:lastRow="0" w:noHBand="0" w:noVBand="1" w:val="04A0"/>
         <w:tblBorders>
@@ -636,7 +636,7 @@
         </w:trPr>
         <w:tc>
           <w:tcPr>
-            <w:tcW w:type="dxa" w:w="5046"/>
+            <w:tcW w:type="dxa" w:w="1928"/>
             <w:vAlign w:val="center"/>
             <w:tcMar>
               <w:top w:w="90" w:type="dxa"/>
@@ -666,7 +666,7 @@
         </w:tc>
         <w:tc>
           <w:tcPr>
-            <w:tcW w:type="dxa" w:w="5046"/>
+            <w:tcW w:type="dxa" w:w="8164"/>
             <w:vAlign w:val="center"/>
             <w:tcMar>
               <w:top w:w="90" w:type="dxa"/>
@@ -701,7 +701,7 @@
         </w:trPr>
         <w:tc>
           <w:tcPr>
-            <w:tcW w:type="dxa" w:w="5046"/>
+            <w:tcW w:type="dxa" w:w="1928"/>
             <w:vAlign w:val="center"/>
             <w:tcMar>
               <w:top w:w="90" w:type="dxa"/>
@@ -731,7 +731,7 @@
         </w:tc>
         <w:tc>
           <w:tcPr>
-            <w:tcW w:type="dxa" w:w="5046"/>
+            <w:tcW w:type="dxa" w:w="8164"/>
             <w:vAlign w:val="center"/>
             <w:tcMar>
               <w:top w:w="90" w:type="dxa"/>
@@ -766,7 +766,7 @@
         </w:trPr>
         <w:tc>
           <w:tcPr>
-            <w:tcW w:type="dxa" w:w="5046"/>
+            <w:tcW w:type="dxa" w:w="1928"/>
             <w:vAlign w:val="center"/>
             <w:tcMar>
               <w:top w:w="90" w:type="dxa"/>
@@ -796,7 +796,7 @@
         </w:tc>
         <w:tc>
           <w:tcPr>
-            <w:tcW w:type="dxa" w:w="5046"/>
+            <w:tcW w:type="dxa" w:w="8164"/>
             <w:vAlign w:val="center"/>
             <w:tcMar>
               <w:top w:w="90" w:type="dxa"/>
@@ -832,7 +832,7 @@
     </w:p>
     <w:tbl>
       <w:tblPr>
-        <w:tblW w:type="auto" w:w="0"/>
+        <w:tblW w:type="dxa" w:w="10091"/>
         <w:tblLayout w:type="fixed"/>
         <w:tblLook w:firstColumn="1" w:firstRow="1" w:lastColumn="0" w:lastRow="0" w:noHBand="0" w:noVBand="1" w:val="04A0"/>
         <w:tblBorders>
@@ -845,8 +845,8 @@
         </w:tblBorders>
       </w:tblPr>
       <w:tblGrid>
-        <w:gridCol w:w="680"/>
-        <w:gridCol w:w="9411"/>
+        <w:gridCol w:w="510"/>
+        <w:gridCol w:w="9581"/>
       </w:tblGrid>
       <w:tr>
         <w:trPr>
@@ -854,7 +854,7 @@
         </w:trPr>
         <w:tc>
           <w:tcPr>
-            <w:tcW w:type="dxa" w:w="5046"/>
+            <w:tcW w:type="dxa" w:w="510"/>
             <w:vAlign w:val="center"/>
             <w:tcMar>
               <w:top w:w="90" w:type="dxa"/>
@@ -884,7 +884,7 @@
         </w:tc>
         <w:tc>
           <w:tcPr>
-            <w:tcW w:type="dxa" w:w="5046"/>
+            <w:tcW w:type="dxa" w:w="9581"/>
             <w:vAlign w:val="center"/>
             <w:tcMar>
               <w:top w:w="90" w:type="dxa"/>
@@ -922,7 +922,7 @@
     </w:p>
     <w:tbl>
       <w:tblPr>
-        <w:tblW w:type="auto" w:w="0"/>
+        <w:tblW w:type="dxa" w:w="10092"/>
         <w:tblLayout w:type="fixed"/>
         <w:tblLook w:firstColumn="1" w:firstRow="1" w:lastColumn="0" w:lastRow="0" w:noHBand="0" w:noVBand="1" w:val="04A0"/>
         <w:tblBorders>
@@ -1080,7 +1080,7 @@
     </w:p>
     <w:tbl>
       <w:tblPr>
-        <w:tblW w:type="auto" w:w="0"/>
+        <w:tblW w:type="dxa" w:w="10091"/>
         <w:tblLayout w:type="fixed"/>
         <w:tblLook w:firstColumn="1" w:firstRow="1" w:lastColumn="0" w:lastRow="0" w:noHBand="0" w:noVBand="1" w:val="04A0"/>
         <w:tblBorders>
@@ -1093,8 +1093,8 @@
         </w:tblBorders>
       </w:tblPr>
       <w:tblGrid>
-        <w:gridCol w:w="680"/>
-        <w:gridCol w:w="9411"/>
+        <w:gridCol w:w="510"/>
+        <w:gridCol w:w="9581"/>
       </w:tblGrid>
       <w:tr>
         <w:trPr>
@@ -1102,7 +1102,7 @@
         </w:trPr>
         <w:tc>
           <w:tcPr>
-            <w:tcW w:type="dxa" w:w="5046"/>
+            <w:tcW w:type="dxa" w:w="510"/>
             <w:vAlign w:val="center"/>
             <w:tcMar>
               <w:top w:w="90" w:type="dxa"/>
@@ -1132,7 +1132,7 @@
         </w:tc>
         <w:tc>
           <w:tcPr>
-            <w:tcW w:type="dxa" w:w="5046"/>
+            <w:tcW w:type="dxa" w:w="9581"/>
             <w:vAlign w:val="center"/>
             <w:tcMar>
               <w:top w:w="90" w:type="dxa"/>
@@ -1170,7 +1170,7 @@
     </w:p>
     <w:tbl>
       <w:tblPr>
-        <w:tblW w:type="auto" w:w="0"/>
+        <w:tblW w:type="dxa" w:w="10092"/>
         <w:tblLayout w:type="fixed"/>
         <w:tblLook w:firstColumn="1" w:firstRow="1" w:lastColumn="0" w:lastRow="0" w:noHBand="0" w:noVBand="1" w:val="04A0"/>
         <w:tblBorders>

</xml_diff>

<commit_message>
Improve severance confirmation exports
</commit_message>
<xml_diff>
--- a/templates/資遣確認單-範本.docx
+++ b/templates/資遣確認單-範本.docx
@@ -51,6 +51,7 @@
       <w:tr>
         <w:trPr>
           <w:cantSplit/>
+          <w:trHeight w:val="510" w:hRule="exact"/>
         </w:trPr>
         <w:tc>
           <w:tcPr>
@@ -143,6 +144,7 @@
       <w:tr>
         <w:trPr>
           <w:cantSplit/>
+          <w:trHeight w:val="510" w:hRule="exact"/>
         </w:trPr>
         <w:tc>
           <w:tcPr>
@@ -268,6 +270,7 @@
       <w:tr>
         <w:trPr>
           <w:cantSplit/>
+          <w:trHeight w:val="510" w:hRule="exact"/>
         </w:trPr>
         <w:tc>
           <w:tcPr>
@@ -393,6 +396,7 @@
       <w:tr>
         <w:trPr>
           <w:cantSplit/>
+          <w:trHeight w:val="510" w:hRule="exact"/>
         </w:trPr>
         <w:tc>
           <w:tcPr>
@@ -542,6 +546,7 @@
       <w:tr>
         <w:trPr>
           <w:cantSplit/>
+          <w:trHeight w:val="510" w:hRule="exact"/>
         </w:trPr>
         <w:tc>
           <w:tcPr>
@@ -632,7 +637,7 @@
       <w:tr>
         <w:trPr>
           <w:cantSplit/>
-          <w:trHeight w:val="1361" w:hRule="atLeast"/>
+          <w:trHeight w:val="1361" w:hRule="exact"/>
         </w:trPr>
         <w:tc>
           <w:tcPr>
@@ -697,7 +702,7 @@
       <w:tr>
         <w:trPr>
           <w:cantSplit/>
-          <w:trHeight w:val="1928" w:hRule="atLeast"/>
+          <w:trHeight w:val="1928" w:hRule="exact"/>
         </w:trPr>
         <w:tc>
           <w:tcPr>
@@ -762,7 +767,7 @@
       <w:tr>
         <w:trPr>
           <w:cantSplit/>
-          <w:trHeight w:val="1020" w:hRule="atLeast"/>
+          <w:trHeight w:val="1020" w:hRule="exact"/>
         </w:trPr>
         <w:tc>
           <w:tcPr>
@@ -851,6 +856,7 @@
       <w:tr>
         <w:trPr>
           <w:cantSplit/>
+          <w:trHeight w:val="510" w:hRule="exact"/>
         </w:trPr>
         <w:tc>
           <w:tcPr>
@@ -941,6 +947,7 @@
       <w:tr>
         <w:trPr>
           <w:cantSplit/>
+          <w:trHeight w:val="510" w:hRule="exact"/>
         </w:trPr>
         <w:tc>
           <w:tcPr>
@@ -1006,6 +1013,7 @@
       <w:tr>
         <w:trPr>
           <w:cantSplit/>
+          <w:trHeight w:val="1250" w:hRule="exact"/>
         </w:trPr>
         <w:tc>
           <w:tcPr>
@@ -1099,6 +1107,7 @@
       <w:tr>
         <w:trPr>
           <w:cantSplit/>
+          <w:trHeight w:val="510" w:hRule="exact"/>
         </w:trPr>
         <w:tc>
           <w:tcPr>
@@ -1189,6 +1198,7 @@
       <w:tr>
         <w:trPr>
           <w:cantSplit/>
+          <w:trHeight w:val="480" w:hRule="exact"/>
         </w:trPr>
         <w:tc>
           <w:tcPr>
@@ -1254,6 +1264,7 @@
       <w:tr>
         <w:trPr>
           <w:cantSplit/>
+          <w:trHeight w:val="480" w:hRule="exact"/>
         </w:trPr>
         <w:tc>
           <w:tcPr>
@@ -1319,6 +1330,7 @@
       <w:tr>
         <w:trPr>
           <w:cantSplit/>
+          <w:trHeight w:val="480" w:hRule="exact"/>
         </w:trPr>
         <w:tc>
           <w:tcPr>

</xml_diff>

<commit_message>
Remove gaps below severance section headers
</commit_message>
<xml_diff>
--- a/templates/資遣確認單-範本.docx
+++ b/templates/資遣確認單-範本.docx
@@ -116,11 +116,6 @@
         </w:tc>
       </w:tr>
     </w:tbl>
-    <w:p>
-      <w:pPr>
-        <w:spacing w:after="40"/>
-      </w:pPr>
-    </w:p>
     <w:tbl>
       <w:tblPr>
         <w:tblW w:type="dxa" w:w="10092"/>
@@ -611,11 +606,6 @@
         </w:tc>
       </w:tr>
     </w:tbl>
-    <w:p>
-      <w:pPr>
-        <w:spacing w:after="40"/>
-      </w:pPr>
-    </w:p>
     <w:tbl>
       <w:tblPr>
         <w:tblW w:type="dxa" w:w="10092"/>
@@ -921,11 +911,6 @@
         </w:tc>
       </w:tr>
     </w:tbl>
-    <w:p>
-      <w:pPr>
-        <w:spacing w:after="40"/>
-      </w:pPr>
-    </w:p>
     <w:tbl>
       <w:tblPr>
         <w:tblW w:type="dxa" w:w="10092"/>
@@ -1172,11 +1157,6 @@
         </w:tc>
       </w:tr>
     </w:tbl>
-    <w:p>
-      <w:pPr>
-        <w:spacing w:after="40"/>
-      </w:pPr>
-    </w:p>
     <w:tbl>
       <w:tblPr>
         <w:tblW w:type="dxa" w:w="10092"/>

</xml_diff>

<commit_message>
Align severance PDF and Word copy
</commit_message>
<xml_diff>
--- a/templates/資遣確認單-範本.docx
+++ b/templates/資遣確認單-範本.docx
@@ -15,19 +15,6 @@
           <w:sz w:val="44"/>
         </w:rPr>
         <w:t>資 遣 確 認 單</w:t>
-      </w:r>
-    </w:p>
-    <w:p>
-      <w:pPr>
-        <w:spacing w:after="160"/>
-        <w:jc w:val="center"/>
-      </w:pPr>
-      <w:r>
-        <w:rPr>
-          <w:color w:val="646E6A"/>
-          <w:sz w:val="18"/>
-        </w:rPr>
-        <w:t>本表供主管與人資確認資遣作業內容及後續行政事項</w:t>
       </w:r>
     </w:p>
     <w:tbl>
@@ -1383,7 +1370,7 @@
           <w:color w:val="646E6A"/>
           <w:sz w:val="17"/>
         </w:rPr>
-        <w:t>備註：本確認單屬內部作業文件，實際終止契約程序及法定義務仍應依個案情形覆核。</w:t>
+        <w:t>備註：本表為內部作業文件，供主管與人資確認資遣流程及後續行政事項。</w:t>
       </w:r>
     </w:p>
     <w:sectPr>

</xml_diff>